<commit_message>
Update live generator met fase 5 fixes
</commit_message>
<xml_diff>
--- a/OntruimingsplanConformNEN8112 260610.docx
+++ b/OntruimingsplanConformNEN8112 260610.docx
@@ -14,6 +14,7 @@
           <w:docPartUnique/>
         </w:docPartObj>
       </w:sdtPr>
+      <w:sdtEndPr/>
       <w:sdtContent>
         <w:p>
           <w:pPr>
@@ -178,7 +179,29 @@
           <w:sz w:val="32"/>
           <w:szCs w:val="32"/>
         </w:rPr>
-        <w:t>{naam_gebouw}</w:t>
+        <w:t>{</w:t>
+      </w:r>
+      <w:proofErr w:type="spellStart"/>
+      <w:r>
+        <w:rPr>
+          <w:rFonts w:ascii="Arial" w:hAnsi="Arial"/>
+          <w:b/>
+          <w:color w:val="2E6FBF"/>
+          <w:sz w:val="32"/>
+          <w:szCs w:val="32"/>
+        </w:rPr>
+        <w:t>naam_gebouw</w:t>
+      </w:r>
+      <w:proofErr w:type="spellEnd"/>
+      <w:r>
+        <w:rPr>
+          <w:rFonts w:ascii="Arial" w:hAnsi="Arial"/>
+          <w:b/>
+          <w:color w:val="2E6FBF"/>
+          <w:sz w:val="32"/>
+          <w:szCs w:val="32"/>
+        </w:rPr>
+        <w:t>}</w:t>
       </w:r>
     </w:p>
     <w:p>
@@ -253,7 +276,25 @@
           <w:color w:val="5A7FA8"/>
           <w:sz w:val="18"/>
         </w:rPr>
-        <w:t>Versiedatum: {datum_rapport}</w:t>
+        <w:t>Versiedatum: {</w:t>
+      </w:r>
+      <w:proofErr w:type="spellStart"/>
+      <w:r>
+        <w:rPr>
+          <w:rFonts w:ascii="Arial" w:hAnsi="Arial"/>
+          <w:color w:val="5A7FA8"/>
+          <w:sz w:val="18"/>
+        </w:rPr>
+        <w:t>datum_rapport</w:t>
+      </w:r>
+      <w:proofErr w:type="spellEnd"/>
+      <w:r>
+        <w:rPr>
+          <w:rFonts w:ascii="Arial" w:hAnsi="Arial"/>
+          <w:color w:val="5A7FA8"/>
+          <w:sz w:val="18"/>
+        </w:rPr>
+        <w:t>}</w:t>
       </w:r>
     </w:p>
     <w:p>
@@ -426,8 +467,13 @@
         <w:spacing w:after="0"/>
       </w:pPr>
       <w:r>
-        <w:t>Overzicht BHV-ers</w:t>
-      </w:r>
+        <w:t>Overzicht BHV-</w:t>
+      </w:r>
+      <w:proofErr w:type="spellStart"/>
+      <w:r>
+        <w:t>ers</w:t>
+      </w:r>
+      <w:proofErr w:type="spellEnd"/>
     </w:p>
     <w:p>
       <w:pPr>
@@ -544,7 +590,15 @@
         <w:spacing w:after="0"/>
       </w:pPr>
       <w:r>
-        <w:t>De directie, het hoofd BHV, ploegleiders BHV, alle BHV-ers/EHBO-ers en de beheerder BMI kennen de inhoud van dit plan.</w:t>
+        <w:t>De directie, het hoofd BHV, ploegleiders BHV, alle BHV-</w:t>
+      </w:r>
+      <w:proofErr w:type="spellStart"/>
+      <w:r>
+        <w:t>ers</w:t>
+      </w:r>
+      <w:proofErr w:type="spellEnd"/>
+      <w:r>
+        <w:t>/EHBO-ers en de beheerder BMI kennen de inhoud van dit plan.</w:t>
       </w:r>
     </w:p>
     <w:p>
@@ -662,7 +716,15 @@
         </w:rPr>
       </w:pPr>
       <w:r>
-        <w:t>Dit plan is door onderstaand persoon gelezen en goedgekeurd op {datum_rapport},</w:t>
+        <w:t>Dit plan is door onderstaand persoon gelezen en goedgekeurd op {</w:t>
+      </w:r>
+      <w:proofErr w:type="spellStart"/>
+      <w:r>
+        <w:t>datum_rapport</w:t>
+      </w:r>
+      <w:proofErr w:type="spellEnd"/>
+      <w:r>
+        <w:t>},</w:t>
       </w:r>
     </w:p>
     <w:p>
@@ -678,7 +740,15 @@
         </w:rPr>
       </w:pPr>
       <w:r>
-        <w:t>{naam_hoogste_manager}</w:t>
+        <w:t>{</w:t>
+      </w:r>
+      <w:proofErr w:type="spellStart"/>
+      <w:r>
+        <w:t>naam_hoogste_manager</w:t>
+      </w:r>
+      <w:proofErr w:type="spellEnd"/>
+      <w:r>
+        <w:t>}</w:t>
       </w:r>
     </w:p>
     <w:p>
@@ -689,7 +759,15 @@
         </w:rPr>
       </w:pPr>
       <w:r>
-        <w:t>{functienaam_hoogste_manager}</w:t>
+        <w:t>{</w:t>
+      </w:r>
+      <w:proofErr w:type="spellStart"/>
+      <w:r>
+        <w:t>functienaam_hoogste_manager</w:t>
+      </w:r>
+      <w:proofErr w:type="spellEnd"/>
+      <w:r>
+        <w:t>}</w:t>
       </w:r>
     </w:p>
     <w:p>
@@ -771,7 +849,15 @@
         <w:t xml:space="preserve"> verzamelplaats</w:t>
       </w:r>
       <w:r>
-        <w:t xml:space="preserve"> {naam_verzamelplaats} aangegeven.</w:t>
+        <w:t xml:space="preserve"> {</w:t>
+      </w:r>
+      <w:proofErr w:type="spellStart"/>
+      <w:r>
+        <w:t>naam_verzamelplaats</w:t>
+      </w:r>
+      <w:proofErr w:type="spellEnd"/>
+      <w:r>
+        <w:t>} aangegeven.</w:t>
       </w:r>
     </w:p>
     <w:p>
@@ -1209,13 +1295,29 @@
         <w:t xml:space="preserve">BMI merk: </w:t>
       </w:r>
       <w:r>
-        <w:t>{bmi_merk}</w:t>
+        <w:t>{</w:t>
+      </w:r>
+      <w:proofErr w:type="spellStart"/>
+      <w:r>
+        <w:t>bmi_merk</w:t>
+      </w:r>
+      <w:proofErr w:type="spellEnd"/>
+      <w:r>
+        <w:t>}</w:t>
       </w:r>
       <w:r>
         <w:t xml:space="preserve">. BMI type: </w:t>
       </w:r>
       <w:r>
-        <w:t>{bmi_type} (*)</w:t>
+        <w:t>{</w:t>
+      </w:r>
+      <w:proofErr w:type="spellStart"/>
+      <w:r>
+        <w:t>bmi_type</w:t>
+      </w:r>
+      <w:proofErr w:type="spellEnd"/>
+      <w:r>
+        <w:t>} (*)</w:t>
       </w:r>
     </w:p>
     <w:p>
@@ -1231,7 +1333,15 @@
         <w:spacing w:after="0"/>
       </w:pPr>
       <w:r>
-        <w:t>Beheerder BMI of installateur heeft alle ploegleiders/BHV-ers een instructie gegeven over: resetten bij vals alarm, in oefenstand zetten, zoemer/signaal uitzetten, aflezen BMI/paneel, reset handbrandmelder.</w:t>
+        <w:t>Beheerder BMI of installateur heeft alle ploegleiders/BHV-</w:t>
+      </w:r>
+      <w:proofErr w:type="spellStart"/>
+      <w:r>
+        <w:t>ers</w:t>
+      </w:r>
+      <w:proofErr w:type="spellEnd"/>
+      <w:r>
+        <w:t xml:space="preserve"> een instructie gegeven over: resetten bij vals alarm, in oefenstand zetten, zoemer/signaal uitzetten, aflezen BMI/paneel, reset handbrandmelder.</w:t>
       </w:r>
     </w:p>
     <w:p>
@@ -1313,7 +1423,15 @@
         <w:t>Automatische blusinstallatie</w:t>
       </w:r>
       <w:r>
-        <w:t>{automatische_blusinstallatie}. (*)</w:t>
+        <w:t>{</w:t>
+      </w:r>
+      <w:proofErr w:type="spellStart"/>
+      <w:r>
+        <w:t>automatische_blusinstallatie</w:t>
+      </w:r>
+      <w:proofErr w:type="spellEnd"/>
+      <w:r>
+        <w:t>}. (*)</w:t>
       </w:r>
     </w:p>
     <w:p>
@@ -1399,7 +1517,15 @@
         <w:t>Brandwerende deuren scheidingen</w:t>
       </w:r>
       <w:r>
-        <w:t>{brandwerende_deuren_scheidingen} (*)</w:t>
+        <w:t>{</w:t>
+      </w:r>
+      <w:proofErr w:type="spellStart"/>
+      <w:r>
+        <w:t>brandwerende_deuren_scheidingen</w:t>
+      </w:r>
+      <w:proofErr w:type="spellEnd"/>
+      <w:r>
+        <w:t>} (*)</w:t>
       </w:r>
     </w:p>
     <w:p>
@@ -1473,7 +1599,23 @@
         <w:t xml:space="preserve">Beheerder BMI voor: </w:t>
       </w:r>
       <w:r>
-        <w:t>Brandmeldinstallatie{Brandmeldinstallatie_(BMI)}. BMI merk: {bmi_merk}. BMI type: {bmi_type} (*)</w:t>
+        <w:t>Brandmeldinstallatie{Brandmeldinstallatie_(BMI)}. BMI merk: {</w:t>
+      </w:r>
+      <w:proofErr w:type="spellStart"/>
+      <w:r>
+        <w:t>bmi_merk</w:t>
+      </w:r>
+      <w:proofErr w:type="spellEnd"/>
+      <w:r>
+        <w:t>}. BMI type: {</w:t>
+      </w:r>
+      <w:proofErr w:type="spellStart"/>
+      <w:r>
+        <w:t>bmi_type</w:t>
+      </w:r>
+      <w:proofErr w:type="spellEnd"/>
+      <w:r>
+        <w:t>} (*)</w:t>
       </w:r>
     </w:p>
     <w:p>
@@ -1567,7 +1709,15 @@
         </w:rPr>
       </w:pPr>
       <w:r>
-        <w:t xml:space="preserve">Whatsappgroep voor onderlinge communicatie met mobiele telefoons tussen bhv-ers </w:t>
+        <w:t>Whatsappgroep voor onderlinge communicatie met mobiele telefoons tussen bhv-</w:t>
+      </w:r>
+      <w:proofErr w:type="spellStart"/>
+      <w:r>
+        <w:t>ers</w:t>
+      </w:r>
+      <w:proofErr w:type="spellEnd"/>
+      <w:r>
+        <w:t xml:space="preserve"> </w:t>
       </w:r>
       <w:r>
         <w:t>{whatsappgroep_voor_onderlinge_communicatie_met_mobiele_telefoons_tussen_bhv</w:t>
@@ -1664,13 +1814,21 @@
         <w:t>hesjes</w:t>
       </w:r>
       <w:r>
-        <w:t>{bhv</w:t>
+        <w:t>{</w:t>
+      </w:r>
+      <w:proofErr w:type="spellStart"/>
+      <w:r>
+        <w:t>bhv</w:t>
       </w:r>
       <w:r>
         <w:t>_</w:t>
       </w:r>
       <w:r>
-        <w:t>hesjes}  (*)</w:t>
+        <w:t>hesjes</w:t>
+      </w:r>
+      <w:proofErr w:type="spellEnd"/>
+      <w:r>
+        <w:t>}  (*)</w:t>
       </w:r>
     </w:p>
     <w:p>
@@ -1781,7 +1939,15 @@
         <w:t>e</w:t>
       </w:r>
       <w:r>
-        <w:t xml:space="preserve"> BHV-ers op.</w:t>
+        <w:t xml:space="preserve"> BHV-</w:t>
+      </w:r>
+      <w:proofErr w:type="spellStart"/>
+      <w:r>
+        <w:t>ers</w:t>
+      </w:r>
+      <w:proofErr w:type="spellEnd"/>
+      <w:r>
+        <w:t xml:space="preserve"> op.</w:t>
       </w:r>
     </w:p>
     <w:p>
@@ -1853,7 +2019,15 @@
         <w:t>en</w:t>
       </w:r>
       <w:r>
-        <w:t>praktijk {naam_huisartsenpraktijk}</w:t>
+        <w:t>praktijk {</w:t>
+      </w:r>
+      <w:proofErr w:type="spellStart"/>
+      <w:r>
+        <w:t>naam_huisartsenpraktijk</w:t>
+      </w:r>
+      <w:proofErr w:type="spellEnd"/>
+      <w:r>
+        <w:t>}</w:t>
       </w:r>
       <w:r>
         <w:t>,</w:t>
@@ -1865,7 +2039,15 @@
         <w:t xml:space="preserve"> </w:t>
       </w:r>
       <w:r>
-        <w:t>{tel_huisartsenpraktijk}</w:t>
+        <w:t>{</w:t>
+      </w:r>
+      <w:proofErr w:type="spellStart"/>
+      <w:r>
+        <w:t>tel_huisartsenpraktijk</w:t>
+      </w:r>
+      <w:proofErr w:type="spellEnd"/>
+      <w:r>
+        <w:t>}</w:t>
       </w:r>
       <w:r>
         <w:t xml:space="preserve"> </w:t>
@@ -1887,9 +2069,11 @@
       <w:r>
         <w:t xml:space="preserve"> bel huisartsenspoedpost {</w:t>
       </w:r>
+      <w:proofErr w:type="spellStart"/>
       <w:r>
         <w:t>telefoonnummer_huisartsenspoedpost</w:t>
       </w:r>
+      <w:proofErr w:type="spellEnd"/>
       <w:r>
         <w:t>}</w:t>
       </w:r>
@@ -1941,7 +2125,15 @@
         <w:t>e</w:t>
       </w:r>
       <w:r>
-        <w:t xml:space="preserve"> BHV-ers op.</w:t>
+        <w:t xml:space="preserve"> BHV-</w:t>
+      </w:r>
+      <w:proofErr w:type="spellStart"/>
+      <w:r>
+        <w:t>ers</w:t>
+      </w:r>
+      <w:proofErr w:type="spellEnd"/>
+      <w:r>
+        <w:t xml:space="preserve"> op.</w:t>
       </w:r>
     </w:p>
     <w:p>
@@ -2077,7 +2269,15 @@
         <w:t>e</w:t>
       </w:r>
       <w:r>
-        <w:t xml:space="preserve"> BHV-ers op.</w:t>
+        <w:t xml:space="preserve"> BHV-</w:t>
+      </w:r>
+      <w:proofErr w:type="spellStart"/>
+      <w:r>
+        <w:t>ers</w:t>
+      </w:r>
+      <w:proofErr w:type="spellEnd"/>
+      <w:r>
+        <w:t xml:space="preserve"> op.</w:t>
       </w:r>
     </w:p>
     <w:p>
@@ -2280,7 +2480,15 @@
         <w:spacing w:after="0"/>
       </w:pPr>
       <w:r>
-        <w:t>Hoofd BHV: verantwoordelijk voor ontruimingsplan, BHV-organisatie en training BHV-ers.</w:t>
+        <w:t>Hoofd BHV: verantwoordelijk voor ontruimingsplan, BHV-organisatie en training BHV-</w:t>
+      </w:r>
+      <w:proofErr w:type="spellStart"/>
+      <w:r>
+        <w:t>ers</w:t>
+      </w:r>
+      <w:proofErr w:type="spellEnd"/>
+      <w:r>
+        <w:t>.</w:t>
       </w:r>
     </w:p>
     <w:p>
@@ -2301,7 +2509,15 @@
         <w:spacing w:after="0"/>
       </w:pPr>
       <w:r>
-        <w:t xml:space="preserve">Ploegleider BHV: 1 BHV-er neemt de leiding en is ploegleider. Hij geeft leiding bij de ontruiming(soefening). </w:t>
+        <w:t>Ploegleider BHV: 1 BHV-er neemt de leiding en is ploegleider. Hij geeft leiding bij de ontruiming(</w:t>
+      </w:r>
+      <w:proofErr w:type="spellStart"/>
+      <w:r>
+        <w:t>soefening</w:t>
+      </w:r>
+      <w:proofErr w:type="spellEnd"/>
+      <w:r>
+        <w:t xml:space="preserve">). </w:t>
       </w:r>
     </w:p>
     <w:p>
@@ -2348,7 +2564,15 @@
         <w:t xml:space="preserve">verzamelplaats </w:t>
       </w:r>
       <w:r>
-        <w:t xml:space="preserve">{naam_verzamelplaats} is en koppelt vermissingen terug aan ploegleider. Hoeft niet persé een BHV-er te zijn. </w:t>
+        <w:t>{</w:t>
+      </w:r>
+      <w:proofErr w:type="spellStart"/>
+      <w:r>
+        <w:t>naam_verzamelplaats</w:t>
+      </w:r>
+      <w:proofErr w:type="spellEnd"/>
+      <w:r>
+        <w:t xml:space="preserve">} is en koppelt vermissingen terug aan ploegleider. Hoeft niet persé een BHV-er te zijn. </w:t>
       </w:r>
     </w:p>
     <w:p>
@@ -2361,7 +2585,15 @@
         <w:spacing w:after="0"/>
       </w:pPr>
       <w:r>
-        <w:t xml:space="preserve">BHV-er 4 (en overige BHV-ers): begeleiden (indien mogelijk in tweetallen) personeel naar buiten. </w:t>
+        <w:t>BHV-er 4 (en overige BHV-</w:t>
+      </w:r>
+      <w:proofErr w:type="spellStart"/>
+      <w:r>
+        <w:t>ers</w:t>
+      </w:r>
+      <w:proofErr w:type="spellEnd"/>
+      <w:r>
+        <w:t xml:space="preserve">): begeleiden (indien mogelijk in tweetallen) personeel naar buiten. </w:t>
       </w:r>
     </w:p>
     <w:p>
@@ -2377,13 +2609,29 @@
         </w:rPr>
       </w:pPr>
       <w:r>
-        <w:t>Beheerder BMI voor: Brandmeldinstallatie{Brandmeldinstallatie_(BMI)}. BMI merk: {bmi_merk}.</w:t>
+        <w:t>Beheerder BMI voor: Brandmeldinstallatie{Brandmeldinstallatie_(BMI)}. BMI merk: {</w:t>
+      </w:r>
+      <w:proofErr w:type="spellStart"/>
+      <w:r>
+        <w:t>bmi_merk</w:t>
+      </w:r>
+      <w:proofErr w:type="spellEnd"/>
+      <w:r>
+        <w:t>}.</w:t>
       </w:r>
       <w:r>
         <w:t xml:space="preserve"> </w:t>
       </w:r>
       <w:r>
-        <w:t>BMI type: {bmi_type}</w:t>
+        <w:t>BMI type: {</w:t>
+      </w:r>
+      <w:proofErr w:type="spellStart"/>
+      <w:r>
+        <w:t>bmi_type</w:t>
+      </w:r>
+      <w:proofErr w:type="spellEnd"/>
+      <w:r>
+        <w:t>}</w:t>
       </w:r>
       <w:r>
         <w:t>. Hij heeft instructie gehad hoe BMI werkt.</w:t>
@@ -2415,22 +2663,58 @@
           <w:color w:val="000000"/>
           <w:shd w:val="clear" w:color="auto" w:fill="FFFFFF"/>
         </w:rPr>
-        <w:t>Indien maar 3 BHV-ers aanwezig: ploegleider belt ook 112.</w:t>
-      </w:r>
-      <w:r>
-        <w:rPr>
-          <w:rFonts w:cstheme="minorHAnsi"/>
-          <w:color w:val="000000"/>
-        </w:rPr>
-        <w:br/>
-      </w:r>
+        <w:t>Indien maar 3 BHV-</w:t>
+      </w:r>
+      <w:proofErr w:type="spellStart"/>
       <w:r>
         <w:rPr>
           <w:rFonts w:cstheme="minorHAnsi"/>
           <w:color w:val="000000"/>
           <w:shd w:val="clear" w:color="auto" w:fill="FFFFFF"/>
         </w:rPr>
-        <w:t xml:space="preserve">Indien maar 2 BHV-ers aanwezig: ploegleider wijst een niet-BHV-er aan als coördinator </w:t>
+        <w:t>ers</w:t>
+      </w:r>
+      <w:proofErr w:type="spellEnd"/>
+      <w:r>
+        <w:rPr>
+          <w:rFonts w:cstheme="minorHAnsi"/>
+          <w:color w:val="000000"/>
+          <w:shd w:val="clear" w:color="auto" w:fill="FFFFFF"/>
+        </w:rPr>
+        <w:t xml:space="preserve"> aanwezig: ploegleider belt ook 112.</w:t>
+      </w:r>
+      <w:r>
+        <w:rPr>
+          <w:rFonts w:cstheme="minorHAnsi"/>
+          <w:color w:val="000000"/>
+        </w:rPr>
+        <w:br/>
+      </w:r>
+      <w:r>
+        <w:rPr>
+          <w:rFonts w:cstheme="minorHAnsi"/>
+          <w:color w:val="000000"/>
+          <w:shd w:val="clear" w:color="auto" w:fill="FFFFFF"/>
+        </w:rPr>
+        <w:t>Indien maar 2 BHV-</w:t>
+      </w:r>
+      <w:proofErr w:type="spellStart"/>
+      <w:r>
+        <w:rPr>
+          <w:rFonts w:cstheme="minorHAnsi"/>
+          <w:color w:val="000000"/>
+          <w:shd w:val="clear" w:color="auto" w:fill="FFFFFF"/>
+        </w:rPr>
+        <w:t>ers</w:t>
+      </w:r>
+      <w:proofErr w:type="spellEnd"/>
+      <w:r>
+        <w:rPr>
+          <w:rFonts w:cstheme="minorHAnsi"/>
+          <w:color w:val="000000"/>
+          <w:shd w:val="clear" w:color="auto" w:fill="FFFFFF"/>
+        </w:rPr>
+        <w:t xml:space="preserve"> aanwezig: ploegleider wijst een niet-BHV-er aan als coördinator </w:t>
       </w:r>
       <w:r>
         <w:rPr>
@@ -2552,6 +2836,7 @@
           <w15:color w:val="060000"/>
           <w:text/>
         </w:sdtPr>
+        <w:sdtEndPr/>
         <w:sdtContent>
           <w:r>
             <w:t>plaats</w:t>
@@ -2572,6 +2857,7 @@
           <w15:color w:val="060000"/>
           <w:text/>
         </w:sdtPr>
+        <w:sdtEndPr/>
         <w:sdtContent>
           <w:r>
             <w:t>plaats</w:t>
@@ -2592,6 +2878,7 @@
           <w15:color w:val="060000"/>
           <w:text/>
         </w:sdtPr>
+        <w:sdtEndPr/>
         <w:sdtContent>
           <w:r>
             <w:t>plaats</w:t>
@@ -2703,7 +2990,15 @@
         <w:spacing w:after="0"/>
       </w:pPr>
       <w:r>
-        <w:t xml:space="preserve">De BMI’s zijn met elkaar gekoppeld. (*) </w:t>
+        <w:t xml:space="preserve">De </w:t>
+      </w:r>
+      <w:proofErr w:type="spellStart"/>
+      <w:r>
+        <w:t>BMI’s</w:t>
+      </w:r>
+      <w:proofErr w:type="spellEnd"/>
+      <w:r>
+        <w:t xml:space="preserve"> zijn met elkaar gekoppeld. (*) </w:t>
       </w:r>
     </w:p>
     <w:p>
@@ -2719,7 +3014,23 @@
         </w:rPr>
       </w:pPr>
       <w:r>
-        <w:t xml:space="preserve">De BMI’s zijn niet met elkaar gekoppeld of er zijn geen BMI’s aanwezig. De </w:t>
+        <w:t xml:space="preserve">De </w:t>
+      </w:r>
+      <w:proofErr w:type="spellStart"/>
+      <w:r>
+        <w:t>BMI’s</w:t>
+      </w:r>
+      <w:proofErr w:type="spellEnd"/>
+      <w:r>
+        <w:t xml:space="preserve"> zijn niet met elkaar gekoppeld of er zijn geen </w:t>
+      </w:r>
+      <w:proofErr w:type="spellStart"/>
+      <w:r>
+        <w:t>BMI’s</w:t>
+      </w:r>
+      <w:proofErr w:type="spellEnd"/>
+      <w:r>
+        <w:t xml:space="preserve"> aanwezig. De </w:t>
       </w:r>
       <w:r>
         <w:t xml:space="preserve">onderling </w:t>
@@ -2834,7 +3145,15 @@
         <w:tab/>
       </w:r>
       <w:r>
-        <w:t xml:space="preserve">: {naam_hoofd_bhv} </w:t>
+        <w:t>: {</w:t>
+      </w:r>
+      <w:proofErr w:type="spellStart"/>
+      <w:r>
+        <w:t>naam_hoofd_bhv</w:t>
+      </w:r>
+      <w:proofErr w:type="spellEnd"/>
+      <w:r>
+        <w:t xml:space="preserve">} </w:t>
       </w:r>
     </w:p>
     <w:p>
@@ -2862,7 +3181,15 @@
         <w:tab/>
       </w:r>
       <w:r>
-        <w:t>: {naam_ploegleider_bhv}</w:t>
+        <w:t>: {</w:t>
+      </w:r>
+      <w:proofErr w:type="spellStart"/>
+      <w:r>
+        <w:t>naam_ploegleider_bhv</w:t>
+      </w:r>
+      <w:proofErr w:type="spellEnd"/>
+      <w:r>
+        <w:t>}</w:t>
       </w:r>
     </w:p>
     <w:p>
@@ -2878,8 +3205,13 @@
         </w:rPr>
       </w:pPr>
       <w:r>
-        <w:t>BHV-ers</w:t>
-      </w:r>
+        <w:t>BHV-</w:t>
+      </w:r>
+      <w:proofErr w:type="spellStart"/>
+      <w:r>
+        <w:t>ers</w:t>
+      </w:r>
+      <w:proofErr w:type="spellEnd"/>
       <w:r>
         <w:tab/>
       </w:r>
@@ -2893,7 +3225,15 @@
         <w:tab/>
       </w:r>
       <w:r>
-        <w:t>: {namen_bhv_ers}</w:t>
+        <w:t>: {</w:t>
+      </w:r>
+      <w:proofErr w:type="spellStart"/>
+      <w:r>
+        <w:t>namen_bhv_ers</w:t>
+      </w:r>
+      <w:proofErr w:type="spellEnd"/>
+      <w:r>
+        <w:t>}</w:t>
       </w:r>
     </w:p>
     <w:p>
@@ -2916,7 +3256,15 @@
         <w:t>:</w:t>
       </w:r>
       <w:r>
-        <w:t xml:space="preserve"> {naam_beheerder_bmi} (*)</w:t>
+        <w:t xml:space="preserve"> {</w:t>
+      </w:r>
+      <w:proofErr w:type="spellStart"/>
+      <w:r>
+        <w:t>naam_beheerder_bmi</w:t>
+      </w:r>
+      <w:proofErr w:type="spellEnd"/>
+      <w:r>
+        <w:t>} (*)</w:t>
       </w:r>
     </w:p>
     <w:p>
@@ -2957,7 +3305,15 @@
         </w:rPr>
       </w:pPr>
       <w:r>
-        <w:t>{naam_gebouw}</w:t>
+        <w:t>{</w:t>
+      </w:r>
+      <w:proofErr w:type="spellStart"/>
+      <w:r>
+        <w:t>naam_gebouw</w:t>
+      </w:r>
+      <w:proofErr w:type="spellEnd"/>
+      <w:r>
+        <w:t>}</w:t>
       </w:r>
     </w:p>
     <w:p>
@@ -2976,22 +3332,6 @@
           <w:u w:val="single"/>
         </w:rPr>
       </w:pPr>
-    </w:p>
-    <w:p>
-      <w:pPr>
-        <w:spacing w:after="0"/>
-        <w:rPr>
-          <w:b/>
-          <w:u w:val="single"/>
-        </w:rPr>
-      </w:pPr>
-      <w:r>
-        <w:rPr>
-          <w:b/>
-          <w:u w:val="single"/>
-        </w:rPr>
-        <w:t>Ontruimingsplan</w:t>
-      </w:r>
     </w:p>
     <w:p>
       <w:pPr>
@@ -3017,7 +3357,15 @@
         <w:spacing w:after="0"/>
       </w:pPr>
       <w:r>
-        <w:t xml:space="preserve">Ploegleider BHV: 1 BHV-er neemt de leiding en is ploegleider. Hij geeft leiding bij de ontruiming(soefening). </w:t>
+        <w:t>Ploegleider BHV: 1 BHV-er neemt de leiding en is ploegleider. Hij geeft leiding bij de ontruiming(</w:t>
+      </w:r>
+      <w:proofErr w:type="spellStart"/>
+      <w:r>
+        <w:t>soefening</w:t>
+      </w:r>
+      <w:proofErr w:type="spellEnd"/>
+      <w:r>
+        <w:t xml:space="preserve">). </w:t>
       </w:r>
     </w:p>
     <w:p>
@@ -3077,7 +3425,15 @@
         <w:spacing w:after="0"/>
       </w:pPr>
       <w:r>
-        <w:t xml:space="preserve">BHV-er 4 (en overige BHV-ers): begeleiden (indien mogelijk in tweetallen) personeel naar buiten. </w:t>
+        <w:t>BHV-er 4 (en overige BHV-</w:t>
+      </w:r>
+      <w:proofErr w:type="spellStart"/>
+      <w:r>
+        <w:t>ers</w:t>
+      </w:r>
+      <w:proofErr w:type="spellEnd"/>
+      <w:r>
+        <w:t xml:space="preserve">): begeleiden (indien mogelijk in tweetallen) personeel naar buiten. </w:t>
       </w:r>
     </w:p>
     <w:p>
@@ -3094,7 +3450,31 @@
         </w:rPr>
       </w:pPr>
       <w:r>
-        <w:t>Bediening {bmi} {bmi_merk} {bmi_type} door beheerder BMI. Hij heeft instructie gehad hoe BMI werkt. (*)</w:t>
+        <w:t>Bediening {</w:t>
+      </w:r>
+      <w:proofErr w:type="spellStart"/>
+      <w:r>
+        <w:t>bmi</w:t>
+      </w:r>
+      <w:proofErr w:type="spellEnd"/>
+      <w:r>
+        <w:t>} {</w:t>
+      </w:r>
+      <w:proofErr w:type="spellStart"/>
+      <w:r>
+        <w:t>bmi_merk</w:t>
+      </w:r>
+      <w:proofErr w:type="spellEnd"/>
+      <w:r>
+        <w:t>} {</w:t>
+      </w:r>
+      <w:proofErr w:type="spellStart"/>
+      <w:r>
+        <w:t>bmi_type</w:t>
+      </w:r>
+      <w:proofErr w:type="spellEnd"/>
+      <w:r>
+        <w:t>} door beheerder BMI. Hij heeft instructie gehad hoe BMI werkt. (*)</w:t>
       </w:r>
     </w:p>
     <w:p>
@@ -3194,7 +3574,15 @@
         </w:rPr>
       </w:pPr>
       <w:r>
-        <w:t>Whatsappgroep voor onderlinge communicatie met mobiele telefoons tussen bhv-ers {whatsappgroep_voor_onderlinge_communicatie_met_mobiele_telefoons_tussen_bhv-ers} (*)</w:t>
+        <w:t>Whatsappgroep voor onderlinge communicatie met mobiele telefoons tussen bhv-</w:t>
+      </w:r>
+      <w:proofErr w:type="spellStart"/>
+      <w:r>
+        <w:t>ers</w:t>
+      </w:r>
+      <w:proofErr w:type="spellEnd"/>
+      <w:r>
+        <w:t xml:space="preserve"> {whatsappgroep_voor_onderlinge_communicatie_met_mobiele_telefoons_tussen_bhv-ers} (*)</w:t>
       </w:r>
     </w:p>
     <w:p>
@@ -3258,7 +3646,15 @@
         </w:rPr>
       </w:pPr>
       <w:r>
-        <w:t>Bhv-hesjes{bhv_hesjes}  (*)</w:t>
+        <w:t>Bhv-hesjes{</w:t>
+      </w:r>
+      <w:proofErr w:type="spellStart"/>
+      <w:r>
+        <w:t>bhv_hesjes</w:t>
+      </w:r>
+      <w:proofErr w:type="spellEnd"/>
+      <w:r>
+        <w:t>}  (*)</w:t>
       </w:r>
     </w:p>
     <w:p>
@@ -3280,6 +3676,10 @@
         </w:rPr>
       </w:pPr>
       <w:r>
+        <w:rPr>
+          <w:b/>
+          <w:bCs/>
+        </w:rPr>
         <w:t>Verzamelplaats</w:t>
       </w:r>
       <w:r>
@@ -3292,29 +3692,49 @@
         <w:rPr>
           <w:bCs/>
         </w:rPr>
-        <w:t>{naam_verzamelplaats}</w:t>
-      </w:r>
-    </w:p>
-    <w:p>
-      <w:pPr>
-        <w:spacing w:after="0"/>
-      </w:pPr>
-    </w:p>
-    <w:p>
-      <w:pPr>
-        <w:spacing w:after="0"/>
-        <w:rPr>
-          <w:b/>
-          <w:u w:val="single"/>
-        </w:rPr>
-      </w:pPr>
-      <w:r>
-        <w:rPr>
-          <w:b/>
-          <w:u w:val="single"/>
-        </w:rPr>
-        <w:t>Verslag ontruimingsoefening</w:t>
-      </w:r>
+        <w:t>{</w:t>
+      </w:r>
+      <w:proofErr w:type="spellStart"/>
+      <w:r>
+        <w:rPr>
+          <w:bCs/>
+        </w:rPr>
+        <w:t>naam_verzamelplaats</w:t>
+      </w:r>
+      <w:proofErr w:type="spellEnd"/>
+      <w:r>
+        <w:rPr>
+          <w:bCs/>
+        </w:rPr>
+        <w:t>}</w:t>
+      </w:r>
+    </w:p>
+    <w:p>
+      <w:pPr>
+        <w:spacing w:after="0"/>
+      </w:pPr>
+    </w:p>
+    <w:p>
+      <w:pPr>
+        <w:spacing w:after="0"/>
+        <w:rPr>
+          <w:b/>
+        </w:rPr>
+      </w:pPr>
+      <w:r>
+        <w:rPr>
+          <w:b/>
+        </w:rPr>
+        <w:t>Namen aanwezige BHV-</w:t>
+      </w:r>
+      <w:proofErr w:type="spellStart"/>
+      <w:r>
+        <w:rPr>
+          <w:b/>
+        </w:rPr>
+        <w:t>ers</w:t>
+      </w:r>
+      <w:proofErr w:type="spellEnd"/>
     </w:p>
     <w:p>
       <w:pPr>
@@ -3339,7 +3759,15 @@
         <w:tab/>
       </w:r>
       <w:r>
-        <w:t xml:space="preserve">: {naam_hoofd_bhv} </w:t>
+        <w:t>: {</w:t>
+      </w:r>
+      <w:proofErr w:type="spellStart"/>
+      <w:r>
+        <w:t>naam_hoofd_bhv</w:t>
+      </w:r>
+      <w:proofErr w:type="spellEnd"/>
+      <w:r>
+        <w:t xml:space="preserve">} </w:t>
       </w:r>
     </w:p>
     <w:p>
@@ -3362,7 +3790,15 @@
         <w:tab/>
       </w:r>
       <w:r>
-        <w:t>: {naam_ploegleider_bhv}</w:t>
+        <w:t>: {</w:t>
+      </w:r>
+      <w:proofErr w:type="spellStart"/>
+      <w:r>
+        <w:t>naam_ploegleider_bhv</w:t>
+      </w:r>
+      <w:proofErr w:type="spellEnd"/>
+      <w:r>
+        <w:t>}</w:t>
       </w:r>
     </w:p>
     <w:p>
@@ -3373,8 +3809,13 @@
         </w:rPr>
       </w:pPr>
       <w:r>
-        <w:t>BHV-ers</w:t>
-      </w:r>
+        <w:t>BHV-</w:t>
+      </w:r>
+      <w:proofErr w:type="spellStart"/>
+      <w:r>
+        <w:t>ers</w:t>
+      </w:r>
+      <w:proofErr w:type="spellEnd"/>
       <w:r>
         <w:tab/>
       </w:r>
@@ -3388,7 +3829,15 @@
         <w:tab/>
       </w:r>
       <w:r>
-        <w:t>: {namen_bhv_ers}</w:t>
+        <w:t>: {</w:t>
+      </w:r>
+      <w:proofErr w:type="spellStart"/>
+      <w:r>
+        <w:t>namen_bhv_ers</w:t>
+      </w:r>
+      <w:proofErr w:type="spellEnd"/>
+      <w:r>
+        <w:t>}</w:t>
       </w:r>
     </w:p>
     <w:p>
@@ -3406,7 +3855,15 @@
         <w:t>:</w:t>
       </w:r>
       <w:r>
-        <w:t xml:space="preserve"> {naam_beheerder_bmi} (*)</w:t>
+        <w:t xml:space="preserve"> {</w:t>
+      </w:r>
+      <w:proofErr w:type="spellStart"/>
+      <w:r>
+        <w:t>naam_beheerder_bmi</w:t>
+      </w:r>
+      <w:proofErr w:type="spellEnd"/>
+      <w:r>
+        <w:t>} (*)</w:t>
       </w:r>
     </w:p>
     <w:p>
@@ -3420,14 +3877,12 @@
         <w:rPr>
           <w:b/>
           <w:bCs/>
-          <w:u w:val="single"/>
         </w:rPr>
       </w:pPr>
       <w:r>
         <w:rPr>
           <w:b/>
           <w:bCs/>
-          <w:u w:val="single"/>
         </w:rPr>
         <w:t>Scenario-omschrijving:</w:t>
       </w:r>
@@ -3625,7 +4080,11 @@
             <w:t xml:space="preserve">Ontruimingsplan </w:t>
           </w:r>
           <w:r>
-            <w:t>{n</w:t>
+            <w:t>{</w:t>
+          </w:r>
+          <w:proofErr w:type="spellStart"/>
+          <w:r>
+            <w:t>n</w:t>
           </w:r>
           <w:r>
             <w:t>aam</w:t>
@@ -3636,6 +4095,7 @@
           <w:r>
             <w:t>gebouw</w:t>
           </w:r>
+          <w:proofErr w:type="spellEnd"/>
           <w:r>
             <w:t>}</w:t>
           </w:r>
@@ -5960,6 +6420,7 @@
     <w:rsid w:val="00483B78"/>
     <w:rsid w:val="004B5BB4"/>
     <w:rsid w:val="004C0510"/>
+    <w:rsid w:val="005039F9"/>
     <w:rsid w:val="0054398B"/>
     <w:rsid w:val="00687F72"/>
     <w:rsid w:val="006B2F71"/>
@@ -5972,6 +6433,7 @@
     <w:rsid w:val="008D6396"/>
     <w:rsid w:val="00906A76"/>
     <w:rsid w:val="00935ACE"/>
+    <w:rsid w:val="009830DE"/>
     <w:rsid w:val="0099143B"/>
     <w:rsid w:val="009F6BCE"/>
     <w:rsid w:val="00A2555B"/>
@@ -5982,12 +6444,14 @@
     <w:rsid w:val="00BB584C"/>
     <w:rsid w:val="00C14D28"/>
     <w:rsid w:val="00CA02EA"/>
+    <w:rsid w:val="00CD0ECF"/>
     <w:rsid w:val="00CD3C43"/>
     <w:rsid w:val="00D96D43"/>
     <w:rsid w:val="00E52DF0"/>
     <w:rsid w:val="00EA0831"/>
     <w:rsid w:val="00F41936"/>
     <w:rsid w:val="00FB00BF"/>
+    <w:rsid w:val="00FE7F93"/>
   </w:rsids>
   <m:mathPr>
     <m:mathFont m:val="Cambria Math"/>
@@ -6769,6 +7233,19 @@
 </file>
 
 <file path=customXml/item2.xml><?xml version="1.0" encoding="utf-8"?>
+<b:Sources xmlns:b="http://schemas.openxmlformats.org/officeDocument/2006/bibliography" xmlns="http://schemas.openxmlformats.org/officeDocument/2006/bibliography" SelectedStyle="\APASixthEditionOfficeOnline.xsl" StyleName="APA" Version="6"/>
+</file>
+
+<file path=customXml/item3.xml><?xml version="1.0" encoding="utf-8"?>
+<?mso-contentType ?>
+<FormTemplates xmlns="http://schemas.microsoft.com/sharepoint/v3/contenttype/forms">
+  <Display>DocumentLibraryForm</Display>
+  <Edit>DocumentLibraryForm</Edit>
+  <New>DocumentLibraryForm</New>
+</FormTemplates>
+</file>
+
+<file path=customXml/item4.xml><?xml version="1.0" encoding="utf-8"?>
 <ct:contentTypeSchema xmlns:ct="http://schemas.microsoft.com/office/2006/metadata/contentType" xmlns:ma="http://schemas.microsoft.com/office/2006/metadata/properties/metaAttributes" ct:_="" ma:_="" ma:contentTypeName="Document" ma:contentTypeID="0x010100E999E8B49F0A824489055A96F2024940" ma:contentTypeVersion="21" ma:contentTypeDescription="Een nieuw document maken." ma:contentTypeScope="" ma:versionID="2fa7051d93b7d49f6aa083af8257b552">
   <xsd:schema xmlns:xsd="http://www.w3.org/2001/XMLSchema" xmlns:xs="http://www.w3.org/2001/XMLSchema" xmlns:p="http://schemas.microsoft.com/office/2006/metadata/properties" xmlns:ns2="b38fedab-6c75-4a28-99b9-fa5274521e3a" xmlns:ns3="7040b6a0-43a9-47a5-9e07-569b438e00d4" targetNamespace="http://schemas.microsoft.com/office/2006/metadata/properties" ma:root="true" ma:fieldsID="cd3ba3b219dd8def9e57e22957d37d99" ns2:_="" ns3:_="">
     <xsd:import namespace="b38fedab-6c75-4a28-99b9-fa5274521e3a"/>
@@ -7039,7 +7516,7 @@
 </ct:contentTypeSchema>
 </file>
 
-<file path=customXml/item3.xml><?xml version="1.0" encoding="utf-8"?>
+<file path=customXml/item5.xml><?xml version="1.0" encoding="utf-8"?>
 <p:properties xmlns:p="http://schemas.microsoft.com/office/2006/metadata/properties" xmlns:xsi="http://www.w3.org/2001/XMLSchema-instance" xmlns:pc="http://schemas.microsoft.com/office/infopath/2007/PartnerControls">
   <documentManagement>
     <MigrationWizIdSecurityGroups xmlns="b38fedab-6c75-4a28-99b9-fa5274521e3a" xsi:nil="true"/>
@@ -7056,19 +7533,6 @@
 </p:properties>
 </file>
 
-<file path=customXml/item4.xml><?xml version="1.0" encoding="utf-8"?>
-<b:Sources xmlns:b="http://schemas.openxmlformats.org/officeDocument/2006/bibliography" xmlns="http://schemas.openxmlformats.org/officeDocument/2006/bibliography" SelectedStyle="\APASixthEditionOfficeOnline.xsl" StyleName="APA" Version="6"/>
-</file>
-
-<file path=customXml/item5.xml><?xml version="1.0" encoding="utf-8"?>
-<?mso-contentType ?>
-<FormTemplates xmlns="http://schemas.microsoft.com/sharepoint/v3/contenttype/forms">
-  <Display>DocumentLibraryForm</Display>
-  <Edit>DocumentLibraryForm</Edit>
-  <New>DocumentLibraryForm</New>
-</FormTemplates>
-</file>
-
 <file path=customXml/itemProps1.xml><?xml version="1.0" encoding="utf-8"?>
 <ds:datastoreItem xmlns:ds="http://schemas.openxmlformats.org/officeDocument/2006/customXml" ds:itemID="{55AF091B-3C7A-41E3-B477-F2FDAA23CFDA}">
   <ds:schemaRefs>
@@ -7078,6 +7542,22 @@
 </file>
 
 <file path=customXml/itemProps2.xml><?xml version="1.0" encoding="utf-8"?>
+<ds:datastoreItem xmlns:ds="http://schemas.openxmlformats.org/officeDocument/2006/customXml" ds:itemID="{9CD5B7A6-9B1F-488B-8F7D-2286C77E2BEA}">
+  <ds:schemaRefs>
+    <ds:schemaRef ds:uri="http://schemas.openxmlformats.org/officeDocument/2006/bibliography"/>
+  </ds:schemaRefs>
+</ds:datastoreItem>
+</file>
+
+<file path=customXml/itemProps3.xml><?xml version="1.0" encoding="utf-8"?>
+<ds:datastoreItem xmlns:ds="http://schemas.openxmlformats.org/officeDocument/2006/customXml" ds:itemID="{A19F038F-3E25-4125-BD53-D3D1D196045A}">
+  <ds:schemaRefs>
+    <ds:schemaRef ds:uri="http://schemas.microsoft.com/sharepoint/v3/contenttype/forms"/>
+  </ds:schemaRefs>
+</ds:datastoreItem>
+</file>
+
+<file path=customXml/itemProps4.xml><?xml version="1.0" encoding="utf-8"?>
 <ds:datastoreItem xmlns:ds="http://schemas.openxmlformats.org/officeDocument/2006/customXml" ds:itemID="{FC451898-71BE-4CC3-A63E-14673D723570}">
   <ds:schemaRefs>
     <ds:schemaRef ds:uri="http://schemas.microsoft.com/office/2006/metadata/contentType"/>
@@ -7096,7 +7576,7 @@
 </ds:datastoreItem>
 </file>
 
-<file path=customXml/itemProps3.xml><?xml version="1.0" encoding="utf-8"?>
+<file path=customXml/itemProps5.xml><?xml version="1.0" encoding="utf-8"?>
 <ds:datastoreItem xmlns:ds="http://schemas.openxmlformats.org/officeDocument/2006/customXml" ds:itemID="{5E77EBFE-CE5A-4E0E-9968-3C7243CFBF70}">
   <ds:schemaRefs>
     <ds:schemaRef ds:uri="http://schemas.microsoft.com/office/2006/metadata/properties"/>
@@ -7105,20 +7585,4 @@
     <ds:schemaRef ds:uri="7040b6a0-43a9-47a5-9e07-569b438e00d4"/>
   </ds:schemaRefs>
 </ds:datastoreItem>
-</file>
-
-<file path=customXml/itemProps4.xml><?xml version="1.0" encoding="utf-8"?>
-<ds:datastoreItem xmlns:ds="http://schemas.openxmlformats.org/officeDocument/2006/customXml" ds:itemID="{9CD5B7A6-9B1F-488B-8F7D-2286C77E2BEA}">
-  <ds:schemaRefs>
-    <ds:schemaRef ds:uri="http://schemas.openxmlformats.org/officeDocument/2006/bibliography"/>
-  </ds:schemaRefs>
-</ds:datastoreItem>
-</file>
-
-<file path=customXml/itemProps5.xml><?xml version="1.0" encoding="utf-8"?>
-<ds:datastoreItem xmlns:ds="http://schemas.openxmlformats.org/officeDocument/2006/customXml" ds:itemID="{A19F038F-3E25-4125-BD53-D3D1D196045A}">
-  <ds:schemaRefs>
-    <ds:schemaRef ds:uri="http://schemas.microsoft.com/sharepoint/v3/contenttype/forms"/>
-  </ds:schemaRefs>
-</ds:datastoreItem>
 </file>
</xml_diff>